<commit_message>
Update CV and related components to reflect changes in professional experience description, replacing "more than 3 years" with "several years" for consistency across the application.
</commit_message>
<xml_diff>
--- a/client/public/CV_Steve_Sanon_ETC_2026.docx
+++ b/client/public/CV_Steve_Sanon_ETC_2026.docx
@@ -170,7 +170,35 @@
           <w:rFonts w:ascii="Century Gothic" w:hAnsi="Century Gothic"/>
           <w:lang w:val="fr-FR"/>
         </w:rPr>
-        <w:t>Ingénieur logiciel et consultant IT, diplômé en Génie Logiciel &amp; Systèmes d’Information, avec plus de 3 ans d’expérience professionnelle dans la conception, le développement et la mise en œuvre de solutions numériques en Afrique. Expertise en développement Full-Stack, applications Web et mobiles, intégration d’API, bases de données, IoT et systèmes d’information géographiques. Expérience en gestion de projet, analyse des besoins, coordination technique et livraison de solutions de bout en bout pour des entreprises, institutions publiques et startups.</w:t>
+        <w:t>Ingénieur logiciel et consultant IT, diplômé en Génie Logiciel &amp; Systèmes d’Information, avec plus</w:t>
+      </w:r>
+      <w:r>
+        <w:rPr>
+          <w:rFonts w:ascii="Century Gothic" w:hAnsi="Century Gothic"/>
+          <w:lang w:val="fr-FR"/>
+        </w:rPr>
+        <w:t>ieurs années</w:t>
+      </w:r>
+      <w:r>
+        <w:rPr>
+          <w:rFonts w:ascii="Century Gothic" w:hAnsi="Century Gothic"/>
+          <w:lang w:val="fr-FR"/>
+        </w:rPr>
+        <w:t xml:space="preserve"> d’expérience</w:t>
+      </w:r>
+      <w:r>
+        <w:rPr>
+          <w:rFonts w:ascii="Century Gothic" w:hAnsi="Century Gothic"/>
+          <w:lang w:val="fr-FR"/>
+        </w:rPr>
+        <w:t>s</w:t>
+      </w:r>
+      <w:r>
+        <w:rPr>
+          <w:rFonts w:ascii="Century Gothic" w:hAnsi="Century Gothic"/>
+          <w:lang w:val="fr-FR"/>
+        </w:rPr>
+        <w:t xml:space="preserve"> professionnelle dans la conception, le développement et la mise en œuvre de solutions numériques en Afrique. Expertise en développement Full-Stack, applications Web et mobiles, intégration d’API, bases de données, IoT et systèmes d’information géographiques. Expérience en gestion de projet, analyse des besoins, coordination technique et livraison de solutions de bout en bout pour des entreprises, institutions publiques et startups.</w:t>
       </w:r>
     </w:p>
     <w:p>
@@ -415,18 +443,8 @@
                 <w:b/>
                 <w:sz w:val="16"/>
               </w:rPr>
-              <w:t xml:space="preserve">SIG &amp; données </w:t>
+              <w:t>SIG &amp; données spatiales</w:t>
             </w:r>
-            <w:proofErr w:type="spellStart"/>
-            <w:r>
-              <w:rPr>
-                <w:rFonts w:ascii="Century Gothic" w:hAnsi="Century Gothic"/>
-                <w:b/>
-                <w:sz w:val="16"/>
-              </w:rPr>
-              <w:t>spatiales</w:t>
-            </w:r>
-            <w:proofErr w:type="spellEnd"/>
           </w:p>
         </w:tc>
         <w:tc>
@@ -495,25 +513,7 @@
                 <w:sz w:val="16"/>
                 <w:lang w:val="fr-FR"/>
               </w:rPr>
-              <w:t xml:space="preserve">Capteurs IoT, intégration API, web </w:t>
-            </w:r>
-            <w:proofErr w:type="spellStart"/>
-            <w:r>
-              <w:rPr>
-                <w:rFonts w:ascii="Century Gothic" w:hAnsi="Century Gothic"/>
-                <w:sz w:val="16"/>
-                <w:lang w:val="fr-FR"/>
-              </w:rPr>
-              <w:t>scraping</w:t>
-            </w:r>
-            <w:proofErr w:type="spellEnd"/>
-            <w:r>
-              <w:rPr>
-                <w:rFonts w:ascii="Century Gothic" w:hAnsi="Century Gothic"/>
-                <w:sz w:val="16"/>
-                <w:lang w:val="fr-FR"/>
-              </w:rPr>
-              <w:t>, Machine Learning, reconnaissance d’objets</w:t>
+              <w:t>Capteurs IoT, intégration API, web scraping, Machine Learning, reconnaissance d’objets</w:t>
             </w:r>
           </w:p>
         </w:tc>
@@ -535,23 +535,13 @@
                 <w:rFonts w:ascii="Century Gothic" w:hAnsi="Century Gothic"/>
               </w:rPr>
             </w:pPr>
-            <w:proofErr w:type="spellStart"/>
             <w:r>
               <w:rPr>
                 <w:rFonts w:ascii="Century Gothic" w:hAnsi="Century Gothic"/>
                 <w:b/>
                 <w:sz w:val="16"/>
               </w:rPr>
-              <w:t>Sécurité</w:t>
-            </w:r>
-            <w:proofErr w:type="spellEnd"/>
-            <w:r>
-              <w:rPr>
-                <w:rFonts w:ascii="Century Gothic" w:hAnsi="Century Gothic"/>
-                <w:b/>
-                <w:sz w:val="16"/>
-              </w:rPr>
-              <w:t xml:space="preserve"> applicative</w:t>
+              <w:t>Sécurité applicative</w:t>
             </w:r>
           </w:p>
         </w:tc>
@@ -649,18 +639,8 @@
                 <w:b/>
                 <w:sz w:val="16"/>
               </w:rPr>
-              <w:t xml:space="preserve">Gestion de </w:t>
+              <w:t>Gestion de projet</w:t>
             </w:r>
-            <w:proofErr w:type="spellStart"/>
-            <w:r>
-              <w:rPr>
-                <w:rFonts w:ascii="Century Gothic" w:hAnsi="Century Gothic"/>
-                <w:b/>
-                <w:sz w:val="16"/>
-              </w:rPr>
-              <w:t>projet</w:t>
-            </w:r>
-            <w:proofErr w:type="spellEnd"/>
           </w:p>
         </w:tc>
         <w:tc>
@@ -709,18 +689,8 @@
                 <w:b/>
                 <w:sz w:val="16"/>
               </w:rPr>
-              <w:t xml:space="preserve">Conseil &amp; </w:t>
+              <w:t>Conseil &amp; accompagnement</w:t>
             </w:r>
-            <w:proofErr w:type="spellStart"/>
-            <w:r>
-              <w:rPr>
-                <w:rFonts w:ascii="Century Gothic" w:hAnsi="Century Gothic"/>
-                <w:b/>
-                <w:sz w:val="16"/>
-              </w:rPr>
-              <w:t>accompagnement</w:t>
-            </w:r>
-            <w:proofErr w:type="spellEnd"/>
           </w:p>
         </w:tc>
         <w:tc>
@@ -836,28 +806,7 @@
           <w:rFonts w:ascii="Century Gothic" w:hAnsi="Century Gothic"/>
           <w:lang w:val="fr-FR"/>
         </w:rPr>
-        <w:t>Chef de projet pour l’implémentation</w:t>
-      </w:r>
-      <w:r>
-        <w:rPr>
-          <w:rFonts w:ascii="Century Gothic" w:hAnsi="Century Gothic"/>
-          <w:lang w:val="fr-FR"/>
-        </w:rPr>
-        <w:t xml:space="preserve"> d’une solution de gestion de projets intégrée à un SIG au Bénin pour le suivi des travaux </w:t>
-      </w:r>
-      <w:r>
-        <w:rPr>
-          <w:rFonts w:ascii="Century Gothic" w:hAnsi="Century Gothic"/>
-          <w:lang w:val="fr-FR"/>
-        </w:rPr>
-        <w:t xml:space="preserve">d’électrifications </w:t>
-      </w:r>
-      <w:r>
-        <w:rPr>
-          <w:rFonts w:ascii="Century Gothic" w:hAnsi="Century Gothic"/>
-          <w:lang w:val="fr-FR"/>
-        </w:rPr>
-        <w:t>et activités terrain.</w:t>
+        <w:t>Chef de projet pour l’implémentation d’une solution de gestion de projets intégrée à un SIG au Bénin pour le suivi des travaux d’électrifications et activités terrain.</w:t>
       </w:r>
     </w:p>
     <w:p>
@@ -1108,18 +1057,8 @@
           <w:b/>
           <w:lang w:val="fr-FR"/>
         </w:rPr>
-        <w:t xml:space="preserve"> — </w:t>
+        <w:t xml:space="preserve"> — Proximind</w:t>
       </w:r>
-      <w:proofErr w:type="spellStart"/>
-      <w:r>
-        <w:rPr>
-          <w:rFonts w:ascii="Century Gothic" w:hAnsi="Century Gothic"/>
-          <w:b/>
-          <w:lang w:val="fr-FR"/>
-        </w:rPr>
-        <w:t>Proximind</w:t>
-      </w:r>
-      <w:proofErr w:type="spellEnd"/>
       <w:r>
         <w:rPr>
           <w:rFonts w:ascii="Century Gothic" w:hAnsi="Century Gothic"/>
@@ -1260,23 +1199,7 @@
           <w:rFonts w:ascii="Century Gothic" w:hAnsi="Century Gothic"/>
           <w:lang w:val="fr-FR"/>
         </w:rPr>
-        <w:t xml:space="preserve">Développement de solutions de web </w:t>
-      </w:r>
-      <w:proofErr w:type="spellStart"/>
-      <w:r>
-        <w:rPr>
-          <w:rFonts w:ascii="Century Gothic" w:hAnsi="Century Gothic"/>
-          <w:lang w:val="fr-FR"/>
-        </w:rPr>
-        <w:t>scraping</w:t>
-      </w:r>
-      <w:proofErr w:type="spellEnd"/>
-      <w:r>
-        <w:rPr>
-          <w:rFonts w:ascii="Century Gothic" w:hAnsi="Century Gothic"/>
-          <w:lang w:val="fr-FR"/>
-        </w:rPr>
-        <w:t>, travaux IoT et reconnaissance d’objets basée sur l’IA.</w:t>
+        <w:t>Développement de solutions de web scraping, travaux IoT et reconnaissance d’objets basée sur l’IA.</w:t>
       </w:r>
     </w:p>
     <w:p>
@@ -1374,23 +1297,7 @@
           <w:rFonts w:ascii="Century Gothic" w:hAnsi="Century Gothic"/>
           <w:lang w:val="fr-FR"/>
         </w:rPr>
-        <w:t xml:space="preserve">Développement d’un outil de web </w:t>
-      </w:r>
-      <w:proofErr w:type="spellStart"/>
-      <w:r>
-        <w:rPr>
-          <w:rFonts w:ascii="Century Gothic" w:hAnsi="Century Gothic"/>
-          <w:lang w:val="fr-FR"/>
-        </w:rPr>
-        <w:t>scraping</w:t>
-      </w:r>
-      <w:proofErr w:type="spellEnd"/>
-      <w:r>
-        <w:rPr>
-          <w:rFonts w:ascii="Century Gothic" w:hAnsi="Century Gothic"/>
-          <w:lang w:val="fr-FR"/>
-        </w:rPr>
-        <w:t xml:space="preserve"> intégrant du Machine Learning pour l’aide à la décision.</w:t>
+        <w:t>Développement d’un outil de web scraping intégrant du Machine Learning pour l’aide à la décision.</w:t>
       </w:r>
     </w:p>
     <w:p>
@@ -1509,17 +1416,8 @@
           <w:rFonts w:ascii="Century Gothic" w:hAnsi="Century Gothic"/>
           <w:lang w:val="fr-FR"/>
         </w:rPr>
-        <w:t xml:space="preserve">HTML &amp; CSS — </w:t>
+        <w:t>HTML &amp; CSS — OpenClassrooms</w:t>
       </w:r>
-      <w:proofErr w:type="spellStart"/>
-      <w:r>
-        <w:rPr>
-          <w:rFonts w:ascii="Century Gothic" w:hAnsi="Century Gothic"/>
-          <w:lang w:val="fr-FR"/>
-        </w:rPr>
-        <w:t>OpenClassrooms</w:t>
-      </w:r>
-      <w:proofErr w:type="spellEnd"/>
     </w:p>
     <w:p>
       <w:pPr>

</xml_diff>